<commit_message>
Punto 11 y correcciones
</commit_message>
<xml_diff>
--- a/Preeliminar/Contexto de la problemática.docx
+++ b/Preeliminar/Contexto de la problemática.docx
@@ -18,8 +18,6 @@
       <w:r>
         <w:t>1. Contexto</w:t>
       </w:r>
-      <w:bookmarkStart w:id="0" w:name="_GoBack"/>
-      <w:bookmarkEnd w:id="0"/>
     </w:p>
     <w:p>
       <w:pPr>
@@ -47,6 +45,9 @@
       </w:r>
     </w:p>
     <w:p>
+      <w:pPr>
+        <w:jc w:val="both"/>
+      </w:pPr>
       <w:r>
         <w:t>Identificar al menos 3 elementos del entorno que influyan en el turismo en Sucre.</w:t>
       </w:r>
@@ -96,9 +97,21 @@
         <w:tc>
           <w:tcPr>
             <w:tcW w:w="4320" w:type="dxa"/>
+            <w:vAlign w:val="center"/>
           </w:tcPr>
           <w:p>
+            <w:pPr>
+              <w:jc w:val="center"/>
+              <w:rPr>
+                <w:b/>
+                <w:bCs/>
+              </w:rPr>
+            </w:pPr>
             <w:r>
+              <w:rPr>
+                <w:b/>
+                <w:bCs/>
+              </w:rPr>
               <w:t>Tipo de entorno</w:t>
             </w:r>
           </w:p>
@@ -106,9 +119,21 @@
         <w:tc>
           <w:tcPr>
             <w:tcW w:w="4320" w:type="dxa"/>
+            <w:vAlign w:val="center"/>
           </w:tcPr>
           <w:p>
+            <w:pPr>
+              <w:jc w:val="center"/>
+              <w:rPr>
+                <w:b/>
+                <w:bCs/>
+              </w:rPr>
+            </w:pPr>
             <w:r>
+              <w:rPr>
+                <w:b/>
+                <w:bCs/>
+              </w:rPr>
               <w:t>Descripción</w:t>
             </w:r>
           </w:p>
@@ -146,6 +171,9 @@
             <w:tcW w:w="4320" w:type="dxa"/>
           </w:tcPr>
           <w:p>
+            <w:pPr>
+              <w:jc w:val="both"/>
+            </w:pPr>
             <w:r>
               <w:t>Relacionado con tecnologías emergentes, innovación digital y nuevas plataformas</w:t>
             </w:r>
@@ -184,6 +212,9 @@
             <w:tcW w:w="4320" w:type="dxa"/>
           </w:tcPr>
           <w:p>
+            <w:pPr>
+              <w:jc w:val="both"/>
+            </w:pPr>
             <w:r>
               <w:t>Factores económicos que afectan la operación o crecimiento de un negocio.</w:t>
             </w:r>
@@ -222,6 +253,9 @@
             <w:tcW w:w="4320" w:type="dxa"/>
           </w:tcPr>
           <w:p>
+            <w:pPr>
+              <w:jc w:val="both"/>
+            </w:pPr>
             <w:r>
               <w:t>Cambios en el comportamiento, preferencias o expectativas de las personas.</w:t>
             </w:r>
@@ -260,6 +294,9 @@
             <w:tcW w:w="4320" w:type="dxa"/>
           </w:tcPr>
           <w:p>
+            <w:pPr>
+              <w:jc w:val="both"/>
+            </w:pPr>
             <w:r>
               <w:t>Aspectos culturales que influyen en la oferta o demanda de servicios.</w:t>
             </w:r>
@@ -325,9 +362,21 @@
         <w:tc>
           <w:tcPr>
             <w:tcW w:w="4320" w:type="dxa"/>
+            <w:vAlign w:val="center"/>
           </w:tcPr>
           <w:p>
+            <w:pPr>
+              <w:jc w:val="center"/>
+              <w:rPr>
+                <w:b/>
+                <w:bCs/>
+              </w:rPr>
+            </w:pPr>
             <w:r>
+              <w:rPr>
+                <w:b/>
+                <w:bCs/>
+              </w:rPr>
               <w:t>Driver</w:t>
             </w:r>
           </w:p>
@@ -335,9 +384,21 @@
         <w:tc>
           <w:tcPr>
             <w:tcW w:w="4320" w:type="dxa"/>
+            <w:vAlign w:val="center"/>
           </w:tcPr>
           <w:p>
+            <w:pPr>
+              <w:jc w:val="center"/>
+              <w:rPr>
+                <w:b/>
+                <w:bCs/>
+              </w:rPr>
+            </w:pPr>
             <w:r>
+              <w:rPr>
+                <w:b/>
+                <w:bCs/>
+              </w:rPr>
               <w:t>Explicación</w:t>
             </w:r>
           </w:p>
@@ -375,8 +436,18 @@
             <w:tcW w:w="4320" w:type="dxa"/>
           </w:tcPr>
           <w:p>
+            <w:pPr>
+              <w:jc w:val="both"/>
+            </w:pPr>
             <w:r>
-              <w:t>uso del comportamiento del usuario para recomendar lugares específicos según sus gustos, haciendo la experiencia más atractiva.</w:t>
+              <w:rPr>
+                <w:rFonts w:hint="default"/>
+                <w:lang w:val="es-ES"/>
+              </w:rPr>
+              <w:t>Us</w:t>
+            </w:r>
+            <w:r>
+              <w:t>o del comportamiento del usuario para recomendar lugares específicos según sus gustos, haciendo la experiencia más atractiva.</w:t>
             </w:r>
           </w:p>
         </w:tc>
@@ -413,6 +484,9 @@
             <w:tcW w:w="4320" w:type="dxa"/>
           </w:tcPr>
           <w:p>
+            <w:pPr>
+              <w:jc w:val="both"/>
+            </w:pPr>
             <w:r>
               <w:t>Las reseñas de los usuarios ayudan a tomar mejores decisiones a los turistas.</w:t>
             </w:r>
@@ -421,14 +495,6 @@
       </w:tr>
       <w:tr>
         <w:tblPrEx>
-          <w:tblBorders>
-            <w:top w:val="single" w:color="auto" w:sz="4" w:space="0"/>
-            <w:left w:val="single" w:color="auto" w:sz="4" w:space="0"/>
-            <w:bottom w:val="single" w:color="auto" w:sz="4" w:space="0"/>
-            <w:right w:val="single" w:color="auto" w:sz="4" w:space="0"/>
-            <w:insideH w:val="single" w:color="auto" w:sz="4" w:space="0"/>
-            <w:insideV w:val="single" w:color="auto" w:sz="4" w:space="0"/>
-          </w:tblBorders>
           <w:tblCellMar>
             <w:top w:w="0" w:type="dxa"/>
             <w:left w:w="108" w:type="dxa"/>
@@ -451,6 +517,9 @@
             <w:tcW w:w="4320" w:type="dxa"/>
           </w:tcPr>
           <w:p>
+            <w:pPr>
+              <w:jc w:val="both"/>
+            </w:pPr>
             <w:r>
               <w:t>Los turistas quieren vivir experiencias más que solo ver lugares (rutas, planes, actividades)</w:t>
             </w:r>
@@ -506,19 +575,25 @@
             <w:insideH w:val="single" w:color="auto" w:sz="4" w:space="0"/>
             <w:insideV w:val="single" w:color="auto" w:sz="4" w:space="0"/>
           </w:tblBorders>
-          <w:tblCellMar>
-            <w:top w:w="0" w:type="dxa"/>
-            <w:left w:w="108" w:type="dxa"/>
-            <w:bottom w:w="0" w:type="dxa"/>
-            <w:right w:w="108" w:type="dxa"/>
-          </w:tblCellMar>
         </w:tblPrEx>
         <w:tc>
           <w:tcPr>
             <w:tcW w:w="4320" w:type="dxa"/>
+            <w:vAlign w:val="center"/>
           </w:tcPr>
           <w:p>
+            <w:pPr>
+              <w:jc w:val="center"/>
+              <w:rPr>
+                <w:b/>
+                <w:bCs/>
+              </w:rPr>
+            </w:pPr>
             <w:r>
+              <w:rPr>
+                <w:b/>
+                <w:bCs/>
+              </w:rPr>
               <w:t>Elemento</w:t>
             </w:r>
           </w:p>
@@ -526,9 +601,21 @@
         <w:tc>
           <w:tcPr>
             <w:tcW w:w="4320" w:type="dxa"/>
+            <w:vAlign w:val="center"/>
           </w:tcPr>
           <w:p>
+            <w:pPr>
+              <w:jc w:val="center"/>
+              <w:rPr>
+                <w:b/>
+                <w:bCs/>
+              </w:rPr>
+            </w:pPr>
             <w:r>
+              <w:rPr>
+                <w:b/>
+                <w:bCs/>
+              </w:rPr>
               <w:t>Descripción</w:t>
             </w:r>
           </w:p>
@@ -566,6 +653,9 @@
             <w:tcW w:w="4320" w:type="dxa"/>
           </w:tcPr>
           <w:p>
+            <w:pPr>
+              <w:jc w:val="both"/>
+            </w:pPr>
             <w:r>
               <w:t xml:space="preserve">Desarrollar una plataforma digital que transforme la oferta turística de Sucre en </w:t>
             </w:r>
@@ -641,9 +731,21 @@
         <w:tc>
           <w:tcPr>
             <w:tcW w:w="4320" w:type="dxa"/>
+            <w:vAlign w:val="center"/>
           </w:tcPr>
           <w:p>
+            <w:pPr>
+              <w:jc w:val="center"/>
+              <w:rPr>
+                <w:b/>
+                <w:bCs/>
+              </w:rPr>
+            </w:pPr>
             <w:r>
+              <w:rPr>
+                <w:b/>
+                <w:bCs/>
+              </w:rPr>
               <w:t>Elemento</w:t>
             </w:r>
           </w:p>
@@ -651,9 +753,21 @@
         <w:tc>
           <w:tcPr>
             <w:tcW w:w="4320" w:type="dxa"/>
+            <w:vAlign w:val="center"/>
           </w:tcPr>
           <w:p>
+            <w:pPr>
+              <w:jc w:val="center"/>
+              <w:rPr>
+                <w:b/>
+                <w:bCs/>
+              </w:rPr>
+            </w:pPr>
             <w:r>
+              <w:rPr>
+                <w:b/>
+                <w:bCs/>
+              </w:rPr>
               <w:t>Descripción</w:t>
             </w:r>
           </w:p>
@@ -691,6 +805,9 @@
             <w:tcW w:w="4320" w:type="dxa"/>
           </w:tcPr>
           <w:p>
+            <w:pPr>
+              <w:jc w:val="both"/>
+            </w:pPr>
             <w:r>
               <w:t>Va dirigido a turistas nacionales e internacionales y habitantes locales interesados en descubrir y explorar lugares turísticos en Sucre.</w:t>
             </w:r>
@@ -729,6 +846,9 @@
             <w:tcW w:w="4320" w:type="dxa"/>
           </w:tcPr>
           <w:p>
+            <w:pPr>
+              <w:jc w:val="both"/>
+            </w:pPr>
             <w:r>
               <w:t>Facilita a los usuarios encontrar, conocer y planificar visitas a lugares turísticos mediante recomendaciones personalizadas, información confiable y experiencias organizadas en una sola plataforma.</w:t>
             </w:r>
@@ -767,6 +887,9 @@
             <w:tcW w:w="4320" w:type="dxa"/>
           </w:tcPr>
           <w:p>
+            <w:pPr>
+              <w:jc w:val="both"/>
+            </w:pPr>
             <w:r>
               <w:t>Generación de ingresos a través de publicidad de negocios locales, promoción de servicios turísticos y comisiones por reservas o experiencias ofrecidas dentro de la aplicación.</w:t>
             </w:r>
@@ -804,53 +927,18 @@
           <w:tcPr>
             <w:tcW w:w="4320" w:type="dxa"/>
           </w:tcPr>
-          <w:tbl>
-            <w:tblPr>
-              <w:tblStyle w:val="12"/>
-              <w:tblW w:w="111" w:type="dxa"/>
-              <w:tblCellSpacing w:w="15" w:type="dxa"/>
-              <w:tblInd w:w="0" w:type="dxa"/>
-              <w:tblLayout w:type="autofit"/>
-              <w:tblCellMar>
-                <w:top w:w="15" w:type="dxa"/>
-                <w:left w:w="15" w:type="dxa"/>
-                <w:bottom w:w="15" w:type="dxa"/>
-                <w:right w:w="15" w:type="dxa"/>
-              </w:tblCellMar>
-            </w:tblPr>
-            <w:tblGrid>
-              <w:gridCol w:w="111"/>
-            </w:tblGrid>
-            <w:tr>
-              <w:tblPrEx>
-                <w:tblCellMar>
-                  <w:top w:w="15" w:type="dxa"/>
-                  <w:left w:w="15" w:type="dxa"/>
-                  <w:bottom w:w="15" w:type="dxa"/>
-                  <w:right w:w="15" w:type="dxa"/>
-                </w:tblCellMar>
-              </w:tblPrEx>
-              <w:trPr>
-                <w:trHeight w:val="8" w:hRule="atLeast"/>
-                <w:tblCellSpacing w:w="15" w:type="dxa"/>
-              </w:trPr>
-              <w:tc>
-                <w:tcPr>
-                  <w:tcW w:w="0" w:type="auto"/>
-                  <w:vAlign w:val="center"/>
-                </w:tcPr>
-                <w:p/>
-              </w:tc>
-            </w:tr>
-          </w:tbl>
           <w:p>
             <w:pPr>
+              <w:jc w:val="both"/>
               <w:rPr>
                 <w:vanish/>
               </w:rPr>
             </w:pPr>
           </w:p>
           <w:p>
+            <w:pPr>
+              <w:jc w:val="both"/>
+            </w:pPr>
             <w:r>
               <w:t>Plataforma enfocada en el turismo local de Sucre que combina personalización, reseñas reales y oferta de experiencias, brindando una solución completa en un solo lugar.</w:t>
             </w:r>
@@ -914,9 +1002,21 @@
         <w:tc>
           <w:tcPr>
             <w:tcW w:w="4320" w:type="dxa"/>
+            <w:vAlign w:val="center"/>
           </w:tcPr>
           <w:p>
+            <w:pPr>
+              <w:jc w:val="center"/>
+              <w:rPr>
+                <w:b/>
+                <w:bCs/>
+              </w:rPr>
+            </w:pPr>
             <w:r>
+              <w:rPr>
+                <w:b/>
+                <w:bCs/>
+              </w:rPr>
               <w:t>Item</w:t>
             </w:r>
           </w:p>
@@ -924,9 +1024,21 @@
         <w:tc>
           <w:tcPr>
             <w:tcW w:w="4320" w:type="dxa"/>
+            <w:vAlign w:val="center"/>
           </w:tcPr>
           <w:p>
+            <w:pPr>
+              <w:jc w:val="center"/>
+              <w:rPr>
+                <w:b/>
+                <w:bCs/>
+              </w:rPr>
+            </w:pPr>
             <w:r>
+              <w:rPr>
+                <w:b/>
+                <w:bCs/>
+              </w:rPr>
               <w:t>Descripción</w:t>
             </w:r>
           </w:p>
@@ -958,7 +1070,17 @@
           </w:tcPr>
           <w:p>
             <w:r>
-              <w:t>Razon Social</w:t>
+              <w:t>Raz</w:t>
+            </w:r>
+            <w:r>
+              <w:rPr>
+                <w:rFonts w:hint="default"/>
+                <w:lang w:val="es-ES"/>
+              </w:rPr>
+              <w:t>ó</w:t>
+            </w:r>
+            <w:r>
+              <w:t>n Social</w:t>
             </w:r>
           </w:p>
         </w:tc>
@@ -1008,8 +1130,18 @@
             <w:tcW w:w="4320" w:type="dxa"/>
           </w:tcPr>
           <w:p>
+            <w:pPr>
+              <w:rPr>
+                <w:rFonts w:hint="default"/>
+                <w:lang w:val="es-ES"/>
+              </w:rPr>
+            </w:pPr>
             <w:r>
-              <w:t xml:space="preserve">Amaurys Zapa </w:t>
+              <w:rPr>
+                <w:rFonts w:hint="default"/>
+                <w:lang w:val="es-ES"/>
+              </w:rPr>
+              <w:t>Eder Zapa</w:t>
             </w:r>
           </w:p>
         </w:tc>
@@ -1052,6 +1184,9 @@
             <w:tcW w:w="4320" w:type="dxa"/>
           </w:tcPr>
           <w:p>
+            <w:pPr>
+              <w:jc w:val="both"/>
+            </w:pPr>
             <w:r>
               <w:t>Brindar una plataforma digital innovadora que conecte a los turistas con los atractivos turísticos del departamento de Sucre, facilitando el acceso a información confiable y experiencias personalizadas.</w:t>
             </w:r>
@@ -1093,6 +1228,9 @@
             <w:tcW w:w="4320" w:type="dxa"/>
           </w:tcPr>
           <w:p>
+            <w:pPr>
+              <w:jc w:val="both"/>
+            </w:pPr>
             <w:r>
               <w:t>En el año 2030 ser reconocida como la principal plataforma digital de turismo en Sucre y expandirse a nivel nacional, promoviendo el desarrollo del turismo local mediante tecnología.</w:t>
             </w:r>
@@ -1100,7 +1238,10 @@
         </w:tc>
       </w:tr>
     </w:tbl>
-    <w:p/>
+    <w:p>
+      <w:bookmarkStart w:id="0" w:name="_GoBack"/>
+      <w:bookmarkEnd w:id="0"/>
+    </w:p>
     <w:p>
       <w:pPr>
         <w:pStyle w:val="2"/>
@@ -1157,9 +1298,21 @@
         <w:tc>
           <w:tcPr>
             <w:tcW w:w="4320" w:type="dxa"/>
+            <w:vAlign w:val="center"/>
           </w:tcPr>
           <w:p>
+            <w:pPr>
+              <w:jc w:val="center"/>
+              <w:rPr>
+                <w:b/>
+                <w:bCs/>
+              </w:rPr>
+            </w:pPr>
             <w:r>
+              <w:rPr>
+                <w:b/>
+                <w:bCs/>
+              </w:rPr>
               <w:t>Item</w:t>
             </w:r>
           </w:p>
@@ -1167,9 +1320,21 @@
         <w:tc>
           <w:tcPr>
             <w:tcW w:w="4320" w:type="dxa"/>
+            <w:vAlign w:val="center"/>
           </w:tcPr>
           <w:p>
+            <w:pPr>
+              <w:jc w:val="center"/>
+              <w:rPr>
+                <w:b/>
+                <w:bCs/>
+              </w:rPr>
+            </w:pPr>
             <w:r>
+              <w:rPr>
+                <w:b/>
+                <w:bCs/>
+              </w:rPr>
               <w:t>Descripción</w:t>
             </w:r>
           </w:p>
@@ -1200,7 +1365,17 @@
             <w:tcW w:w="4320" w:type="dxa"/>
           </w:tcPr>
           <w:p>
+            <w:pPr>
+              <w:rPr>
+                <w:b w:val="0"/>
+                <w:bCs w:val="0"/>
+              </w:rPr>
+            </w:pPr>
             <w:r>
+              <w:rPr>
+                <w:b w:val="0"/>
+                <w:bCs w:val="0"/>
+              </w:rPr>
               <w:t>Estrategia</w:t>
             </w:r>
           </w:p>
@@ -1210,6 +1385,9 @@
             <w:tcW w:w="4320" w:type="dxa"/>
           </w:tcPr>
           <w:p>
+            <w:pPr>
+              <w:jc w:val="both"/>
+            </w:pPr>
             <w:r>
               <w:t>Implementar marketing digital a través de redes sociales para atraer y fidelizar usuarios en la plataforma Sincinaty.</w:t>
             </w:r>
@@ -1241,9 +1419,17 @@
             <w:tcW w:w="4320" w:type="dxa"/>
           </w:tcPr>
           <w:p>
+            <w:pPr>
+              <w:rPr>
+                <w:b w:val="0"/>
+                <w:bCs w:val="0"/>
+              </w:rPr>
+            </w:pPr>
             <w:r>
               <w:rPr>
                 <w:rFonts w:ascii="Cambria" w:hAnsi="Cambria" w:eastAsia="Cambria" w:cs="Cambria"/>
+                <w:b w:val="0"/>
+                <w:bCs w:val="0"/>
               </w:rPr>
               <w:t>Ventaja competitiva</w:t>
             </w:r>
@@ -1254,6 +1440,9 @@
             <w:tcW w:w="4320" w:type="dxa"/>
           </w:tcPr>
           <w:p>
+            <w:pPr>
+              <w:jc w:val="both"/>
+            </w:pPr>
             <w:r>
               <w:t>Sincinaty se diferencia por el uso de inteligencia artificial para ofrecer recomendaciones personalizadas, integrar reseñas reales y centralizar experiencias turísticas locales en una sola aplicación enfocada en el departamento de Sucre.</w:t>
             </w:r>
@@ -1326,9 +1515,21 @@
         <w:tc>
           <w:tcPr>
             <w:tcW w:w="4320" w:type="dxa"/>
+            <w:vAlign w:val="center"/>
           </w:tcPr>
           <w:p>
+            <w:pPr>
+              <w:jc w:val="center"/>
+              <w:rPr>
+                <w:b/>
+                <w:bCs/>
+              </w:rPr>
+            </w:pPr>
             <w:r>
+              <w:rPr>
+                <w:b/>
+                <w:bCs/>
+              </w:rPr>
               <w:t>Funcionalidad</w:t>
             </w:r>
           </w:p>
@@ -1336,9 +1537,21 @@
         <w:tc>
           <w:tcPr>
             <w:tcW w:w="4320" w:type="dxa"/>
+            <w:vAlign w:val="center"/>
           </w:tcPr>
           <w:p>
+            <w:pPr>
+              <w:jc w:val="center"/>
+              <w:rPr>
+                <w:b/>
+                <w:bCs/>
+              </w:rPr>
+            </w:pPr>
             <w:r>
+              <w:rPr>
+                <w:b/>
+                <w:bCs/>
+              </w:rPr>
               <w:t>Descripción</w:t>
             </w:r>
           </w:p>
@@ -1366,7 +1579,17 @@
             <w:tcW w:w="4320" w:type="dxa"/>
           </w:tcPr>
           <w:p>
+            <w:pPr>
+              <w:rPr>
+                <w:b w:val="0"/>
+                <w:bCs w:val="0"/>
+              </w:rPr>
+            </w:pPr>
             <w:r>
+              <w:rPr>
+                <w:b w:val="0"/>
+                <w:bCs w:val="0"/>
+              </w:rPr>
               <w:t>Registro e inicio de sesión</w:t>
             </w:r>
           </w:p>
@@ -1376,6 +1599,9 @@
             <w:tcW w:w="4320" w:type="dxa"/>
           </w:tcPr>
           <w:p>
+            <w:pPr>
+              <w:jc w:val="both"/>
+            </w:pPr>
             <w:r>
               <w:t>Permite a los usuarios crear una cuenta y guardar sus preferencias dentro de la app.</w:t>
             </w:r>
@@ -1404,7 +1630,17 @@
             <w:tcW w:w="4320" w:type="dxa"/>
           </w:tcPr>
           <w:p>
+            <w:pPr>
+              <w:rPr>
+                <w:b w:val="0"/>
+                <w:bCs w:val="0"/>
+              </w:rPr>
+            </w:pPr>
             <w:r>
+              <w:rPr>
+                <w:b w:val="0"/>
+                <w:bCs w:val="0"/>
+              </w:rPr>
               <w:t>Exploración de lugares turísticos</w:t>
             </w:r>
           </w:p>
@@ -1414,6 +1650,9 @@
             <w:tcW w:w="4320" w:type="dxa"/>
           </w:tcPr>
           <w:p>
+            <w:pPr>
+              <w:jc w:val="both"/>
+            </w:pPr>
             <w:r>
               <w:t>Muestra sitios turísticos con imágenes, descripción, ubicación y categorías.</w:t>
             </w:r>
@@ -1442,7 +1681,17 @@
             <w:tcW w:w="4320" w:type="dxa"/>
           </w:tcPr>
           <w:p>
+            <w:pPr>
+              <w:rPr>
+                <w:b w:val="0"/>
+                <w:bCs w:val="0"/>
+              </w:rPr>
+            </w:pPr>
             <w:r>
+              <w:rPr>
+                <w:b w:val="0"/>
+                <w:bCs w:val="0"/>
+              </w:rPr>
               <w:t>Recomendaciones personalizadas</w:t>
             </w:r>
           </w:p>
@@ -1452,6 +1701,9 @@
             <w:tcW w:w="4320" w:type="dxa"/>
           </w:tcPr>
           <w:p>
+            <w:pPr>
+              <w:jc w:val="both"/>
+            </w:pPr>
             <w:r>
               <w:t>Muestra sitios turísticos con imágenes, descripción, ubicación y categorías.</w:t>
             </w:r>
@@ -1480,7 +1732,17 @@
             <w:tcW w:w="4320" w:type="dxa"/>
           </w:tcPr>
           <w:p>
+            <w:pPr>
+              <w:rPr>
+                <w:b w:val="0"/>
+                <w:bCs w:val="0"/>
+              </w:rPr>
+            </w:pPr>
             <w:r>
+              <w:rPr>
+                <w:b w:val="0"/>
+                <w:bCs w:val="0"/>
+              </w:rPr>
               <w:t>Geolocalización</w:t>
             </w:r>
           </w:p>
@@ -1490,6 +1752,9 @@
             <w:tcW w:w="4320" w:type="dxa"/>
           </w:tcPr>
           <w:p>
+            <w:pPr>
+              <w:jc w:val="both"/>
+            </w:pPr>
             <w:r>
               <w:t>Permite ver lugares cercanos según la ubicación actual del usuario.</w:t>
             </w:r>
@@ -1545,13 +1810,31 @@
             <w:insideH w:val="single" w:color="auto" w:sz="4" w:space="0"/>
             <w:insideV w:val="single" w:color="auto" w:sz="4" w:space="0"/>
           </w:tblBorders>
+          <w:tblCellMar>
+            <w:top w:w="0" w:type="dxa"/>
+            <w:left w:w="108" w:type="dxa"/>
+            <w:bottom w:w="0" w:type="dxa"/>
+            <w:right w:w="108" w:type="dxa"/>
+          </w:tblCellMar>
         </w:tblPrEx>
         <w:tc>
           <w:tcPr>
             <w:tcW w:w="4320" w:type="dxa"/>
+            <w:vAlign w:val="center"/>
           </w:tcPr>
           <w:p>
+            <w:pPr>
+              <w:jc w:val="center"/>
+              <w:rPr>
+                <w:b/>
+                <w:bCs/>
+              </w:rPr>
+            </w:pPr>
             <w:r>
+              <w:rPr>
+                <w:b/>
+                <w:bCs/>
+              </w:rPr>
               <w:t>Uso de IA</w:t>
             </w:r>
           </w:p>
@@ -1559,9 +1842,21 @@
         <w:tc>
           <w:tcPr>
             <w:tcW w:w="4320" w:type="dxa"/>
+            <w:vAlign w:val="center"/>
           </w:tcPr>
           <w:p>
+            <w:pPr>
+              <w:jc w:val="center"/>
+              <w:rPr>
+                <w:b/>
+                <w:bCs/>
+              </w:rPr>
+            </w:pPr>
             <w:r>
+              <w:rPr>
+                <w:b/>
+                <w:bCs/>
+              </w:rPr>
               <w:t>Justificación</w:t>
             </w:r>
           </w:p>
@@ -1599,6 +1894,9 @@
             <w:tcW w:w="4320" w:type="dxa"/>
           </w:tcPr>
           <w:p>
+            <w:pPr>
+              <w:jc w:val="both"/>
+            </w:pPr>
             <w:r>
               <w:t>La inteligencia artificial analiza los gustos y comportamiento del usuario para sugerir lugares turísticos acordes a sus intereses, mejorando la experiencia dentro de la app.</w:t>
             </w:r>
@@ -1637,6 +1935,9 @@
             <w:tcW w:w="4320" w:type="dxa"/>
           </w:tcPr>
           <w:p>
+            <w:pPr>
+              <w:jc w:val="both"/>
+            </w:pPr>
             <w:r>
               <w:t>Permite responder de manera rápida y automática las consultas de los usuarios, brindando información sobre lugares, rutas y actividades disponibles en cualquier momento.</w:t>
             </w:r>
@@ -1692,19 +1993,25 @@
             <w:insideH w:val="single" w:color="auto" w:sz="4" w:space="0"/>
             <w:insideV w:val="single" w:color="auto" w:sz="4" w:space="0"/>
           </w:tblBorders>
-          <w:tblCellMar>
-            <w:top w:w="0" w:type="dxa"/>
-            <w:left w:w="108" w:type="dxa"/>
-            <w:bottom w:w="0" w:type="dxa"/>
-            <w:right w:w="108" w:type="dxa"/>
-          </w:tblCellMar>
         </w:tblPrEx>
         <w:tc>
           <w:tcPr>
             <w:tcW w:w="4320" w:type="dxa"/>
+            <w:vAlign w:val="center"/>
           </w:tcPr>
           <w:p>
+            <w:pPr>
+              <w:jc w:val="center"/>
+              <w:rPr>
+                <w:b/>
+                <w:bCs/>
+              </w:rPr>
+            </w:pPr>
             <w:r>
+              <w:rPr>
+                <w:b/>
+                <w:bCs/>
+              </w:rPr>
               <w:t>Rol</w:t>
             </w:r>
           </w:p>
@@ -1712,9 +2019,21 @@
         <w:tc>
           <w:tcPr>
             <w:tcW w:w="4320" w:type="dxa"/>
+            <w:vAlign w:val="center"/>
           </w:tcPr>
           <w:p>
+            <w:pPr>
+              <w:jc w:val="center"/>
+              <w:rPr>
+                <w:b/>
+                <w:bCs/>
+              </w:rPr>
+            </w:pPr>
             <w:r>
+              <w:rPr>
+                <w:b/>
+                <w:bCs/>
+              </w:rPr>
               <w:t>Responsabilidad</w:t>
             </w:r>
           </w:p>
@@ -1742,8 +2061,21 @@
             <w:tcW w:w="4320" w:type="dxa"/>
           </w:tcPr>
           <w:p>
+            <w:pPr>
+              <w:rPr>
+                <w:rFonts w:hint="default"/>
+                <w:lang w:val="es-ES"/>
+              </w:rPr>
+            </w:pPr>
             <w:r>
               <w:t>CEO (Chief Executive Officer)</w:t>
+            </w:r>
+            <w:r>
+              <w:rPr>
+                <w:rFonts w:hint="default"/>
+                <w:lang w:val="es-ES"/>
+              </w:rPr>
+              <w:t xml:space="preserve"> </w:t>
             </w:r>
           </w:p>
         </w:tc>
@@ -1752,6 +2084,9 @@
             <w:tcW w:w="4320" w:type="dxa"/>
           </w:tcPr>
           <w:p>
+            <w:pPr>
+              <w:jc w:val="both"/>
+            </w:pPr>
             <w:r>
               <w:t>Dirigir la empresa, tomar decisiones estratégicas y supervisar el crecimiento de Sincinaty.</w:t>
             </w:r>
@@ -1790,6 +2125,9 @@
             <w:tcW w:w="4320" w:type="dxa"/>
           </w:tcPr>
           <w:p>
+            <w:pPr>
+              <w:jc w:val="both"/>
+            </w:pPr>
             <w:r>
               <w:t>Gestionar la tecnología, asegurando el correcto funcionamiento y desarrollo de la plataforma.</w:t>
             </w:r>
@@ -1828,6 +2166,9 @@
             <w:tcW w:w="4320" w:type="dxa"/>
           </w:tcPr>
           <w:p>
+            <w:pPr>
+              <w:jc w:val="both"/>
+            </w:pPr>
             <w:r>
               <w:t>Diseñar y ejecutar estrategias de marketing digital para atraer y fidelizar usuarios.</w:t>
             </w:r>
@@ -1845,15 +2186,37 @@
     </w:p>
     <w:p>
       <w:pPr>
+        <w:bidi w:val="0"/>
+        <w:jc w:val="both"/>
         <w:rPr>
-          <w:rFonts w:asciiTheme="majorHAnsi" w:hAnsiTheme="majorHAnsi" w:eastAsiaTheme="majorEastAsia" w:cstheme="majorBidi"/>
-          <w:b/>
-          <w:bCs/>
-          <w:color w:val="376092" w:themeColor="accent1" w:themeShade="BF"/>
-          <w:sz w:val="28"/>
-          <w:szCs w:val="28"/>
+          <w:rFonts w:hint="default"/>
+          <w:lang w:val="es-ES"/>
         </w:rPr>
       </w:pPr>
+      <w:r>
+        <w:rPr>
+          <w:rFonts w:hint="default"/>
+          <w:lang w:val="es-ES"/>
+        </w:rPr>
+        <w:t xml:space="preserve">Implementar una Arquitectura Empresarial es fundamental para Sincinaty porque permite alinear las estrategías tecnológicas al responder directamente a la misión de digitalizar el turismo en Sucre. Por otra parte, la AE actúa como un plano maestro que permite alinear la estrategía de negocios (misión y visión al 2030) con la infraestructura tecnológica. </w:t>
+      </w:r>
+    </w:p>
+    <w:p>
+      <w:pPr>
+        <w:bidi w:val="0"/>
+        <w:jc w:val="both"/>
+        <w:rPr>
+          <w:rFonts w:hint="default"/>
+          <w:lang w:val="es-ES"/>
+        </w:rPr>
+      </w:pPr>
+      <w:r>
+        <w:rPr>
+          <w:rFonts w:hint="default"/>
+          <w:lang w:val="es-ES"/>
+        </w:rPr>
+        <w:t>Su implementación se justica principalmente en tres razones: la primera razón, asegurar la interoperabilidad e integración, permitiendo que la plataforma integre facilmente servicios diversos como hoteles, transporte y guías locales; segundo, facilita la escalabilidad, permitiendo que el sistema crezca. Y por último, optimiza la toma de desiciones mediante una estructura de datos clara, lo que potencia el uso de la Inteligencia Artifical para ofrecer recomendaciones personalizadas y precisas que impulsen el desarrollo económico del departamento.</w:t>
+      </w:r>
     </w:p>
     <w:p>
       <w:pPr>
@@ -1921,69 +2284,44 @@
             <w:right w:w="108" w:type="dxa"/>
           </w:tblCellMar>
         </w:tblPrEx>
+        <w:trPr>
+          <w:hidden/>
+        </w:trPr>
         <w:tc>
           <w:tcPr>
             <w:tcW w:w="2926" w:type="dxa"/>
+            <w:vAlign w:val="center"/>
           </w:tcPr>
-          <w:tbl>
-            <w:tblPr>
-              <w:tblStyle w:val="12"/>
-              <w:tblW w:w="0" w:type="auto"/>
-              <w:tblCellSpacing w:w="15" w:type="dxa"/>
-              <w:tblInd w:w="0" w:type="dxa"/>
-              <w:tblLayout w:type="autofit"/>
-              <w:tblCellMar>
-                <w:top w:w="15" w:type="dxa"/>
-                <w:left w:w="15" w:type="dxa"/>
-                <w:bottom w:w="15" w:type="dxa"/>
-                <w:right w:w="15" w:type="dxa"/>
-              </w:tblCellMar>
-            </w:tblPr>
-            <w:tblGrid>
-              <w:gridCol w:w="1256"/>
-            </w:tblGrid>
-            <w:tr>
-              <w:tblPrEx>
-                <w:tblCellMar>
-                  <w:top w:w="15" w:type="dxa"/>
-                  <w:left w:w="15" w:type="dxa"/>
-                  <w:bottom w:w="15" w:type="dxa"/>
-                  <w:right w:w="15" w:type="dxa"/>
-                </w:tblCellMar>
-              </w:tblPrEx>
-              <w:trPr>
-                <w:tblCellSpacing w:w="15" w:type="dxa"/>
-              </w:trPr>
-              <w:tc>
-                <w:tcPr>
-                  <w:tcW w:w="0" w:type="auto"/>
-                  <w:vAlign w:val="center"/>
-                </w:tcPr>
-                <w:p>
-                  <w:pPr>
-                    <w:spacing w:after="0" w:line="240" w:lineRule="auto"/>
-                    <w:jc w:val="center"/>
-                    <w:rPr>
-                      <w:b/>
-                      <w:bCs/>
-                    </w:rPr>
-                  </w:pPr>
-                  <w:r>
-                    <w:rPr>
-                      <w:b/>
-                      <w:bCs/>
-                    </w:rPr>
-                    <w:t>Documento</w:t>
-                  </w:r>
-                </w:p>
-              </w:tc>
-            </w:tr>
-          </w:tbl>
           <w:p>
             <w:pPr>
               <w:spacing w:after="0" w:line="240" w:lineRule="auto"/>
               <w:jc w:val="center"/>
               <w:rPr>
+                <w:rFonts w:hint="default"/>
+                <w:b/>
+                <w:bCs/>
+                <w:vanish/>
+                <w:lang w:val="es-ES"/>
+              </w:rPr>
+            </w:pPr>
+            <w:r>
+              <w:rPr>
+                <w:rFonts w:hint="default"/>
+                <w:b/>
+                <w:bCs/>
+                <w:vanish/>
+                <w:lang w:val="es-ES"/>
+              </w:rPr>
+              <w:t>DpDocumen</w:t>
+            </w:r>
+          </w:p>
+          <w:p>
+            <w:pPr>
+              <w:spacing w:after="0" w:line="240" w:lineRule="auto"/>
+              <w:jc w:val="center"/>
+              <w:rPr>
+                <w:b/>
+                <w:bCs/>
                 <w:vanish/>
               </w:rPr>
             </w:pPr>
@@ -1993,29 +2331,30 @@
               <w:spacing w:after="0" w:line="240" w:lineRule="auto"/>
               <w:jc w:val="center"/>
               <w:rPr>
-                <w:vanish/>
+                <w:rFonts w:hint="default"/>
+                <w:lang w:val="es-ES"/>
               </w:rPr>
             </w:pPr>
-          </w:p>
-          <w:p>
-            <w:pPr>
-              <w:spacing w:after="0" w:line="240" w:lineRule="auto"/>
-              <w:jc w:val="center"/>
-            </w:pPr>
+            <w:r>
+              <w:rPr>
+                <w:rFonts w:hint="default"/>
+                <w:b/>
+                <w:bCs/>
+                <w:lang w:val="es-ES"/>
+              </w:rPr>
+              <w:t>Documento</w:t>
+            </w:r>
           </w:p>
         </w:tc>
         <w:tc>
           <w:tcPr>
             <w:tcW w:w="3381" w:type="dxa"/>
+            <w:vAlign w:val="center"/>
           </w:tcPr>
           <w:p>
             <w:pPr>
               <w:spacing w:after="0" w:line="240" w:lineRule="auto"/>
               <w:jc w:val="center"/>
-              <w:rPr>
-                <w:b/>
-                <w:bCs/>
-              </w:rPr>
             </w:pPr>
             <w:r>
               <w:rPr>
@@ -2025,25 +2364,16 @@
               <w:t>Para qué sirve en el taller</w:t>
             </w:r>
           </w:p>
-          <w:p>
-            <w:pPr>
-              <w:spacing w:after="0" w:line="240" w:lineRule="auto"/>
-              <w:jc w:val="center"/>
-            </w:pPr>
-          </w:p>
         </w:tc>
         <w:tc>
           <w:tcPr>
             <w:tcW w:w="2473" w:type="dxa"/>
+            <w:vAlign w:val="center"/>
           </w:tcPr>
           <w:p>
             <w:pPr>
               <w:spacing w:after="0" w:line="240" w:lineRule="auto"/>
               <w:jc w:val="center"/>
-              <w:rPr>
-                <w:b/>
-                <w:bCs/>
-              </w:rPr>
             </w:pPr>
             <w:r>
               <w:rPr>
@@ -2052,12 +2382,6 @@
               </w:rPr>
               <w:t>Enlace</w:t>
             </w:r>
-          </w:p>
-          <w:p>
-            <w:pPr>
-              <w:spacing w:after="0" w:line="240" w:lineRule="auto"/>
-              <w:jc w:val="center"/>
-            </w:pPr>
           </w:p>
         </w:tc>
       </w:tr>
@@ -2098,6 +2422,7 @@
           <w:p>
             <w:pPr>
               <w:spacing w:after="0" w:line="240" w:lineRule="auto"/>
+              <w:jc w:val="both"/>
             </w:pPr>
             <w:r>
               <w:t>Entender la estrategia del departamento, prioridades económicas, inversión pública y visión del territorio. Sirve para construir el contexto del caso.</w:t>
@@ -2173,6 +2498,7 @@
           <w:p>
             <w:pPr>
               <w:spacing w:after="0" w:line="240" w:lineRule="auto"/>
+              <w:jc w:val="both"/>
             </w:pPr>
             <w:r>
               <w:t>Describe problemas y oportunidades del turismo, digitalización, promoción del destino. Sirve para identificar elementos del entorno.</w:t>
@@ -2248,6 +2574,7 @@
           <w:p>
             <w:pPr>
               <w:spacing w:after="0" w:line="240" w:lineRule="auto"/>
+              <w:jc w:val="both"/>
             </w:pPr>
             <w:r>
               <w:t>Define programas para desarrollar el turismo, competitividad del destino y desarrollo de productos turísticos. Sirve para identificar drivers.</w:t>
@@ -2273,7 +2600,7 @@
             </w:r>
             <w:r>
               <w:rPr>
-                <w:rStyle w:val="21"/>
+                <w:rStyle w:val="18"/>
               </w:rPr>
               <w:t>Documento 3</w:t>
             </w:r>
@@ -2323,6 +2650,7 @@
           <w:p>
             <w:pPr>
               <w:spacing w:after="0" w:line="240" w:lineRule="auto"/>
+              <w:jc w:val="both"/>
             </w:pPr>
             <w:r>
               <w:t>Define actores del ecosistema turístico y gobernanza (gobernación, alcaldías, empresarios). Sirve para identificar stakeholders y gobernanza.</w:t>
@@ -2744,17 +3072,17 @@
     <w:lsdException w:qFormat="1" w:unhideWhenUsed="0" w:uiPriority="61" w:semiHidden="0" w:name="Light List"/>
     <w:lsdException w:qFormat="1" w:unhideWhenUsed="0" w:uiPriority="62" w:semiHidden="0" w:name="Light Grid"/>
     <w:lsdException w:qFormat="1" w:unhideWhenUsed="0" w:uiPriority="63" w:semiHidden="0" w:name="Medium Shading 1"/>
-    <w:lsdException w:unhideWhenUsed="0" w:uiPriority="64" w:semiHidden="0" w:name="Medium Shading 2"/>
+    <w:lsdException w:qFormat="1" w:unhideWhenUsed="0" w:uiPriority="64" w:semiHidden="0" w:name="Medium Shading 2"/>
     <w:lsdException w:qFormat="1" w:unhideWhenUsed="0" w:uiPriority="65" w:semiHidden="0" w:name="Medium List 1"/>
     <w:lsdException w:qFormat="1" w:unhideWhenUsed="0" w:uiPriority="66" w:semiHidden="0" w:name="Medium List 2"/>
     <w:lsdException w:unhideWhenUsed="0" w:uiPriority="67" w:semiHidden="0" w:name="Medium Grid 1"/>
-    <w:lsdException w:unhideWhenUsed="0" w:uiPriority="68" w:semiHidden="0" w:name="Medium Grid 2"/>
+    <w:lsdException w:qFormat="1" w:unhideWhenUsed="0" w:uiPriority="68" w:semiHidden="0" w:name="Medium Grid 2"/>
     <w:lsdException w:unhideWhenUsed="0" w:uiPriority="69" w:semiHidden="0" w:name="Medium Grid 3"/>
     <w:lsdException w:unhideWhenUsed="0" w:uiPriority="70" w:semiHidden="0" w:name="Dark List"/>
     <w:lsdException w:unhideWhenUsed="0" w:uiPriority="71" w:semiHidden="0" w:name="Colorful Shading"/>
     <w:lsdException w:qFormat="1" w:unhideWhenUsed="0" w:uiPriority="72" w:semiHidden="0" w:name="Colorful List"/>
     <w:lsdException w:qFormat="1" w:unhideWhenUsed="0" w:uiPriority="73" w:semiHidden="0" w:name="Colorful Grid"/>
-    <w:lsdException w:unhideWhenUsed="0" w:uiPriority="60" w:semiHidden="0" w:name="Light Shading Accent 1"/>
+    <w:lsdException w:qFormat="1" w:unhideWhenUsed="0" w:uiPriority="60" w:semiHidden="0" w:name="Light Shading Accent 1"/>
     <w:lsdException w:qFormat="1" w:unhideWhenUsed="0" w:uiPriority="61" w:semiHidden="0" w:name="Light List Accent 1"/>
     <w:lsdException w:unhideWhenUsed="0" w:uiPriority="62" w:semiHidden="0" w:name="Light Grid Accent 1"/>
     <w:lsdException w:unhideWhenUsed="0" w:uiPriority="63" w:semiHidden="0" w:name="Medium Shading 1 Accent 1"/>
@@ -2763,7 +3091,7 @@
     <w:lsdException w:qFormat="1" w:unhideWhenUsed="0" w:uiPriority="34" w:semiHidden="0" w:name="List Paragraph"/>
     <w:lsdException w:qFormat="1" w:unhideWhenUsed="0" w:uiPriority="29" w:semiHidden="0" w:name="Quote"/>
     <w:lsdException w:qFormat="1" w:unhideWhenUsed="0" w:uiPriority="30" w:semiHidden="0" w:name="Intense Quote"/>
-    <w:lsdException w:unhideWhenUsed="0" w:uiPriority="66" w:semiHidden="0" w:name="Medium List 2 Accent 1"/>
+    <w:lsdException w:qFormat="1" w:unhideWhenUsed="0" w:uiPriority="66" w:semiHidden="0" w:name="Medium List 2 Accent 1"/>
     <w:lsdException w:qFormat="1" w:unhideWhenUsed="0" w:uiPriority="67" w:semiHidden="0" w:name="Medium Grid 1 Accent 1"/>
     <w:lsdException w:unhideWhenUsed="0" w:uiPriority="68" w:semiHidden="0" w:name="Medium Grid 2 Accent 1"/>
     <w:lsdException w:unhideWhenUsed="0" w:uiPriority="69" w:semiHidden="0" w:name="Medium Grid 3 Accent 1"/>
@@ -2790,10 +3118,10 @@
     <w:lsdException w:qFormat="1" w:unhideWhenUsed="0" w:uiPriority="62" w:semiHidden="0" w:name="Light Grid Accent 3"/>
     <w:lsdException w:unhideWhenUsed="0" w:uiPriority="63" w:semiHidden="0" w:name="Medium Shading 1 Accent 3"/>
     <w:lsdException w:qFormat="1" w:unhideWhenUsed="0" w:uiPriority="64" w:semiHidden="0" w:name="Medium Shading 2 Accent 3"/>
-    <w:lsdException w:unhideWhenUsed="0" w:uiPriority="65" w:semiHidden="0" w:name="Medium List 1 Accent 3"/>
-    <w:lsdException w:unhideWhenUsed="0" w:uiPriority="66" w:semiHidden="0" w:name="Medium List 2 Accent 3"/>
-    <w:lsdException w:unhideWhenUsed="0" w:uiPriority="67" w:semiHidden="0" w:name="Medium Grid 1 Accent 3"/>
-    <w:lsdException w:unhideWhenUsed="0" w:uiPriority="68" w:semiHidden="0" w:name="Medium Grid 2 Accent 3"/>
+    <w:lsdException w:qFormat="1" w:unhideWhenUsed="0" w:uiPriority="65" w:semiHidden="0" w:name="Medium List 1 Accent 3"/>
+    <w:lsdException w:qFormat="1" w:unhideWhenUsed="0" w:uiPriority="66" w:semiHidden="0" w:name="Medium List 2 Accent 3"/>
+    <w:lsdException w:qFormat="1" w:unhideWhenUsed="0" w:uiPriority="67" w:semiHidden="0" w:name="Medium Grid 1 Accent 3"/>
+    <w:lsdException w:qFormat="1" w:unhideWhenUsed="0" w:uiPriority="68" w:semiHidden="0" w:name="Medium Grid 2 Accent 3"/>
     <w:lsdException w:unhideWhenUsed="0" w:uiPriority="69" w:semiHidden="0" w:name="Medium Grid 3 Accent 3"/>
     <w:lsdException w:unhideWhenUsed="0" w:uiPriority="70" w:semiHidden="0" w:name="Dark List Accent 3"/>
     <w:lsdException w:unhideWhenUsed="0" w:uiPriority="71" w:semiHidden="0" w:name="Colorful Shading Accent 3"/>
@@ -2803,11 +3131,11 @@
     <w:lsdException w:qFormat="1" w:unhideWhenUsed="0" w:uiPriority="61" w:semiHidden="0" w:name="Light List Accent 4"/>
     <w:lsdException w:qFormat="1" w:unhideWhenUsed="0" w:uiPriority="62" w:semiHidden="0" w:name="Light Grid Accent 4"/>
     <w:lsdException w:unhideWhenUsed="0" w:uiPriority="63" w:semiHidden="0" w:name="Medium Shading 1 Accent 4"/>
-    <w:lsdException w:unhideWhenUsed="0" w:uiPriority="64" w:semiHidden="0" w:name="Medium Shading 2 Accent 4"/>
-    <w:lsdException w:unhideWhenUsed="0" w:uiPriority="65" w:semiHidden="0" w:name="Medium List 1 Accent 4"/>
+    <w:lsdException w:qFormat="1" w:unhideWhenUsed="0" w:uiPriority="64" w:semiHidden="0" w:name="Medium Shading 2 Accent 4"/>
+    <w:lsdException w:qFormat="1" w:unhideWhenUsed="0" w:uiPriority="65" w:semiHidden="0" w:name="Medium List 1 Accent 4"/>
     <w:lsdException w:unhideWhenUsed="0" w:uiPriority="66" w:semiHidden="0" w:name="Medium List 2 Accent 4"/>
-    <w:lsdException w:unhideWhenUsed="0" w:uiPriority="67" w:semiHidden="0" w:name="Medium Grid 1 Accent 4"/>
-    <w:lsdException w:unhideWhenUsed="0" w:uiPriority="68" w:semiHidden="0" w:name="Medium Grid 2 Accent 4"/>
+    <w:lsdException w:qFormat="1" w:unhideWhenUsed="0" w:uiPriority="67" w:semiHidden="0" w:name="Medium Grid 1 Accent 4"/>
+    <w:lsdException w:qFormat="1" w:unhideWhenUsed="0" w:uiPriority="68" w:semiHidden="0" w:name="Medium Grid 2 Accent 4"/>
     <w:lsdException w:unhideWhenUsed="0" w:uiPriority="69" w:semiHidden="0" w:name="Medium Grid 3 Accent 4"/>
     <w:lsdException w:unhideWhenUsed="0" w:uiPriority="70" w:semiHidden="0" w:name="Dark List Accent 4"/>
     <w:lsdException w:unhideWhenUsed="0" w:uiPriority="71" w:semiHidden="0" w:name="Colorful Shading Accent 4"/>
@@ -2818,9 +3146,9 @@
     <w:lsdException w:qFormat="1" w:unhideWhenUsed="0" w:uiPriority="62" w:semiHidden="0" w:name="Light Grid Accent 5"/>
     <w:lsdException w:qFormat="1" w:unhideWhenUsed="0" w:uiPriority="63" w:semiHidden="0" w:name="Medium Shading 1 Accent 5"/>
     <w:lsdException w:qFormat="1" w:unhideWhenUsed="0" w:uiPriority="64" w:semiHidden="0" w:name="Medium Shading 2 Accent 5"/>
-    <w:lsdException w:unhideWhenUsed="0" w:uiPriority="65" w:semiHidden="0" w:name="Medium List 1 Accent 5"/>
+    <w:lsdException w:qFormat="1" w:unhideWhenUsed="0" w:uiPriority="65" w:semiHidden="0" w:name="Medium List 1 Accent 5"/>
     <w:lsdException w:qFormat="1" w:unhideWhenUsed="0" w:uiPriority="66" w:semiHidden="0" w:name="Medium List 2 Accent 5"/>
-    <w:lsdException w:unhideWhenUsed="0" w:uiPriority="67" w:semiHidden="0" w:name="Medium Grid 1 Accent 5"/>
+    <w:lsdException w:qFormat="1" w:unhideWhenUsed="0" w:uiPriority="67" w:semiHidden="0" w:name="Medium Grid 1 Accent 5"/>
     <w:lsdException w:unhideWhenUsed="0" w:uiPriority="68" w:semiHidden="0" w:name="Medium Grid 2 Accent 5"/>
     <w:lsdException w:unhideWhenUsed="0" w:uiPriority="69" w:semiHidden="0" w:name="Medium Grid 3 Accent 5"/>
     <w:lsdException w:unhideWhenUsed="0" w:uiPriority="70" w:semiHidden="0" w:name="Dark List Accent 5"/>
@@ -2828,12 +3156,12 @@
     <w:lsdException w:qFormat="1" w:unhideWhenUsed="0" w:uiPriority="72" w:semiHidden="0" w:name="Colorful List Accent 5"/>
     <w:lsdException w:qFormat="1" w:unhideWhenUsed="0" w:uiPriority="73" w:semiHidden="0" w:name="Colorful Grid Accent 5"/>
     <w:lsdException w:qFormat="1" w:unhideWhenUsed="0" w:uiPriority="60" w:semiHidden="0" w:name="Light Shading Accent 6"/>
-    <w:lsdException w:unhideWhenUsed="0" w:uiPriority="61" w:semiHidden="0" w:name="Light List Accent 6"/>
+    <w:lsdException w:qFormat="1" w:unhideWhenUsed="0" w:uiPriority="61" w:semiHidden="0" w:name="Light List Accent 6"/>
     <w:lsdException w:qFormat="1" w:unhideWhenUsed="0" w:uiPriority="62" w:semiHidden="0" w:name="Light Grid Accent 6"/>
     <w:lsdException w:qFormat="1" w:unhideWhenUsed="0" w:uiPriority="63" w:semiHidden="0" w:name="Medium Shading 1 Accent 6"/>
-    <w:lsdException w:unhideWhenUsed="0" w:uiPriority="64" w:semiHidden="0" w:name="Medium Shading 2 Accent 6"/>
-    <w:lsdException w:unhideWhenUsed="0" w:uiPriority="65" w:semiHidden="0" w:name="Medium List 1 Accent 6"/>
-    <w:lsdException w:unhideWhenUsed="0" w:uiPriority="66" w:semiHidden="0" w:name="Medium List 2 Accent 6"/>
+    <w:lsdException w:qFormat="1" w:unhideWhenUsed="0" w:uiPriority="64" w:semiHidden="0" w:name="Medium Shading 2 Accent 6"/>
+    <w:lsdException w:qFormat="1" w:unhideWhenUsed="0" w:uiPriority="65" w:semiHidden="0" w:name="Medium List 1 Accent 6"/>
+    <w:lsdException w:qFormat="1" w:unhideWhenUsed="0" w:uiPriority="66" w:semiHidden="0" w:name="Medium List 2 Accent 6"/>
     <w:lsdException w:unhideWhenUsed="0" w:uiPriority="67" w:semiHidden="0" w:name="Medium Grid 1 Accent 6"/>
     <w:lsdException w:unhideWhenUsed="0" w:uiPriority="68" w:semiHidden="0" w:name="Medium Grid 2 Accent 6"/>
     <w:lsdException w:unhideWhenUsed="0" w:uiPriority="69" w:semiHidden="0" w:name="Medium Grid 3 Accent 6"/>
@@ -3596,6 +3924,7 @@
   <w:style w:type="table" w:styleId="40">
     <w:name w:val="Light Shading Accent 1"/>
     <w:basedOn w:val="12"/>
+    <w:qFormat/>
     <w:uiPriority w:val="60"/>
     <w:pPr>
       <w:spacing w:after="0" w:line="240" w:lineRule="auto"/>
@@ -4687,6 +5016,7 @@
   <w:style w:type="table" w:styleId="52">
     <w:name w:val="Light List Accent 6"/>
     <w:basedOn w:val="12"/>
+    <w:qFormat/>
     <w:uiPriority w:val="61"/>
     <w:pPr>
       <w:spacing w:after="0" w:line="240" w:lineRule="auto"/>
@@ -6330,6 +6660,7 @@
   <w:style w:type="table" w:styleId="67">
     <w:name w:val="Medium Shading 2"/>
     <w:basedOn w:val="12"/>
+    <w:qFormat/>
     <w:uiPriority w:val="64"/>
     <w:pPr>
       <w:spacing w:after="0" w:line="240" w:lineRule="auto"/>
@@ -6968,6 +7299,7 @@
   <w:style w:type="table" w:styleId="71">
     <w:name w:val="Medium Shading 2 Accent 4"/>
     <w:basedOn w:val="12"/>
+    <w:qFormat/>
     <w:uiPriority w:val="64"/>
     <w:pPr>
       <w:spacing w:after="0" w:line="240" w:lineRule="auto"/>
@@ -7287,6 +7619,7 @@
   <w:style w:type="table" w:styleId="73">
     <w:name w:val="Medium Shading 2 Accent 6"/>
     <w:basedOn w:val="12"/>
+    <w:qFormat/>
     <w:uiPriority w:val="64"/>
     <w:pPr>
       <w:spacing w:after="0" w:line="240" w:lineRule="auto"/>
@@ -7700,6 +8033,7 @@
   <w:style w:type="table" w:styleId="77">
     <w:name w:val="Medium List 1 Accent 3"/>
     <w:basedOn w:val="12"/>
+    <w:qFormat/>
     <w:uiPriority w:val="65"/>
     <w:pPr>
       <w:spacing w:after="0" w:line="240" w:lineRule="auto"/>
@@ -7784,6 +8118,7 @@
   <w:style w:type="table" w:styleId="78">
     <w:name w:val="Medium List 1 Accent 4"/>
     <w:basedOn w:val="12"/>
+    <w:qFormat/>
     <w:uiPriority w:val="65"/>
     <w:pPr>
       <w:spacing w:after="0" w:line="240" w:lineRule="auto"/>
@@ -7868,6 +8203,7 @@
   <w:style w:type="table" w:styleId="79">
     <w:name w:val="Medium List 1 Accent 5"/>
     <w:basedOn w:val="12"/>
+    <w:qFormat/>
     <w:uiPriority w:val="65"/>
     <w:pPr>
       <w:spacing w:after="0" w:line="240" w:lineRule="auto"/>
@@ -7952,6 +8288,7 @@
   <w:style w:type="table" w:styleId="80">
     <w:name w:val="Medium List 1 Accent 6"/>
     <w:basedOn w:val="12"/>
+    <w:qFormat/>
     <w:uiPriority w:val="65"/>
     <w:pPr>
       <w:spacing w:after="0" w:line="240" w:lineRule="auto"/>
@@ -8160,6 +8497,7 @@
   <w:style w:type="table" w:styleId="82">
     <w:name w:val="Medium List 2 Accent 1"/>
     <w:basedOn w:val="12"/>
+    <w:qFormat/>
     <w:uiPriority w:val="66"/>
     <w:pPr>
       <w:spacing w:after="0" w:line="240" w:lineRule="auto"/>
@@ -8407,6 +8745,7 @@
   <w:style w:type="table" w:styleId="84">
     <w:name w:val="Medium List 2 Accent 3"/>
     <w:basedOn w:val="12"/>
+    <w:qFormat/>
     <w:uiPriority w:val="66"/>
     <w:pPr>
       <w:spacing w:after="0" w:line="240" w:lineRule="auto"/>
@@ -8777,6 +9116,7 @@
   <w:style w:type="table" w:styleId="87">
     <w:name w:val="Medium List 2 Accent 6"/>
     <w:basedOn w:val="12"/>
+    <w:qFormat/>
     <w:uiPriority w:val="66"/>
     <w:pPr>
       <w:spacing w:after="0" w:line="240" w:lineRule="auto"/>
@@ -9090,6 +9430,7 @@
   <w:style w:type="table" w:styleId="91">
     <w:name w:val="Medium Grid 1 Accent 3"/>
     <w:basedOn w:val="12"/>
+    <w:qFormat/>
     <w:uiPriority w:val="67"/>
     <w:pPr>
       <w:spacing w:after="0" w:line="240" w:lineRule="auto"/>
@@ -9153,6 +9494,7 @@
   <w:style w:type="table" w:styleId="92">
     <w:name w:val="Medium Grid 1 Accent 4"/>
     <w:basedOn w:val="12"/>
+    <w:qFormat/>
     <w:uiPriority w:val="67"/>
     <w:pPr>
       <w:spacing w:after="0" w:line="240" w:lineRule="auto"/>
@@ -9216,6 +9558,7 @@
   <w:style w:type="table" w:styleId="93">
     <w:name w:val="Medium Grid 1 Accent 5"/>
     <w:basedOn w:val="12"/>
+    <w:qFormat/>
     <w:uiPriority w:val="67"/>
     <w:pPr>
       <w:spacing w:after="0" w:line="240" w:lineRule="auto"/>
@@ -9342,6 +9685,7 @@
   <w:style w:type="table" w:styleId="95">
     <w:name w:val="Medium Grid 2"/>
     <w:basedOn w:val="12"/>
+    <w:qFormat/>
     <w:uiPriority w:val="68"/>
     <w:pPr>
       <w:spacing w:after="0" w:line="240" w:lineRule="auto"/>
@@ -9762,6 +10106,7 @@
   <w:style w:type="table" w:styleId="98">
     <w:name w:val="Medium Grid 2 Accent 3"/>
     <w:basedOn w:val="12"/>
+    <w:qFormat/>
     <w:uiPriority w:val="68"/>
     <w:pPr>
       <w:spacing w:after="0" w:line="240" w:lineRule="auto"/>
@@ -9902,6 +10247,7 @@
   <w:style w:type="table" w:styleId="99">
     <w:name w:val="Medium Grid 2 Accent 4"/>
     <w:basedOn w:val="12"/>
+    <w:qFormat/>
     <w:uiPriority w:val="68"/>
     <w:pPr>
       <w:spacing w:after="0" w:line="240" w:lineRule="auto"/>

</xml_diff>

<commit_message>
Correcciones del punto 11
</commit_message>
<xml_diff>
--- a/Preeliminar/Contexto de la problemática.docx
+++ b/Preeliminar/Contexto de la problemática.docx
@@ -495,6 +495,14 @@
       </w:tr>
       <w:tr>
         <w:tblPrEx>
+          <w:tblBorders>
+            <w:top w:val="single" w:color="auto" w:sz="4" w:space="0"/>
+            <w:left w:val="single" w:color="auto" w:sz="4" w:space="0"/>
+            <w:bottom w:val="single" w:color="auto" w:sz="4" w:space="0"/>
+            <w:right w:val="single" w:color="auto" w:sz="4" w:space="0"/>
+            <w:insideH w:val="single" w:color="auto" w:sz="4" w:space="0"/>
+            <w:insideV w:val="single" w:color="auto" w:sz="4" w:space="0"/>
+          </w:tblBorders>
           <w:tblCellMar>
             <w:top w:w="0" w:type="dxa"/>
             <w:left w:w="108" w:type="dxa"/>
@@ -575,6 +583,12 @@
             <w:insideH w:val="single" w:color="auto" w:sz="4" w:space="0"/>
             <w:insideV w:val="single" w:color="auto" w:sz="4" w:space="0"/>
           </w:tblBorders>
+          <w:tblCellMar>
+            <w:top w:w="0" w:type="dxa"/>
+            <w:left w:w="108" w:type="dxa"/>
+            <w:bottom w:w="0" w:type="dxa"/>
+            <w:right w:w="108" w:type="dxa"/>
+          </w:tblCellMar>
         </w:tblPrEx>
         <w:tc>
           <w:tcPr>
@@ -1238,10 +1252,7 @@
         </w:tc>
       </w:tr>
     </w:tbl>
-    <w:p>
-      <w:bookmarkStart w:id="0" w:name="_GoBack"/>
-      <w:bookmarkEnd w:id="0"/>
-    </w:p>
+    <w:p/>
     <w:p>
       <w:pPr>
         <w:pStyle w:val="2"/>
@@ -1993,6 +2004,12 @@
             <w:insideH w:val="single" w:color="auto" w:sz="4" w:space="0"/>
             <w:insideV w:val="single" w:color="auto" w:sz="4" w:space="0"/>
           </w:tblBorders>
+          <w:tblCellMar>
+            <w:top w:w="0" w:type="dxa"/>
+            <w:left w:w="108" w:type="dxa"/>
+            <w:bottom w:w="0" w:type="dxa"/>
+            <w:right w:w="108" w:type="dxa"/>
+          </w:tblCellMar>
         </w:tblPrEx>
         <w:tc>
           <w:tcPr>
@@ -2198,8 +2215,10 @@
           <w:rFonts w:hint="default"/>
           <w:lang w:val="es-ES"/>
         </w:rPr>
-        <w:t xml:space="preserve">Implementar una Arquitectura Empresarial es fundamental para Sincinaty porque permite alinear las estrategías tecnológicas al responder directamente a la misión de digitalizar el turismo en Sucre. Por otra parte, la AE actúa como un plano maestro que permite alinear la estrategía de negocios (misión y visión al 2030) con la infraestructura tecnológica. </w:t>
+        <w:t>Implementar una Arquitectura Empresarial es fundamental para Sincinaty porque permite alinear las estrategías tecnológicas al responder directamente a la misión de digitalizar el turismo en Sucre. Por otra parte, la AE actúa como un plano maestro que permite alinear la estrategía de negocios (misión y visión al 2030) con la infraestructura tecnológica. Este marco estructura eficientemente los datos necesarios para que la Inteligencia Artificial ofrezca recomendaciones personalizadas, integrando a todos los actores locales en un ecosistema unificado. Así, se garantiza que el MVP inicial sea escalable y flexible, evitando la deuda técnica y asegurando una expansión nacional exitosa hacia 2030, todo en perfecta sintonía con los planes de desarrollo y competitividad de la región.</w:t>
       </w:r>
+      <w:bookmarkStart w:id="0" w:name="_GoBack"/>
+      <w:bookmarkEnd w:id="0"/>
     </w:p>
     <w:p>
       <w:pPr>
@@ -3084,7 +3103,7 @@
     <w:lsdException w:qFormat="1" w:unhideWhenUsed="0" w:uiPriority="73" w:semiHidden="0" w:name="Colorful Grid"/>
     <w:lsdException w:qFormat="1" w:unhideWhenUsed="0" w:uiPriority="60" w:semiHidden="0" w:name="Light Shading Accent 1"/>
     <w:lsdException w:qFormat="1" w:unhideWhenUsed="0" w:uiPriority="61" w:semiHidden="0" w:name="Light List Accent 1"/>
-    <w:lsdException w:unhideWhenUsed="0" w:uiPriority="62" w:semiHidden="0" w:name="Light Grid Accent 1"/>
+    <w:lsdException w:qFormat="1" w:unhideWhenUsed="0" w:uiPriority="62" w:semiHidden="0" w:name="Light Grid Accent 1"/>
     <w:lsdException w:unhideWhenUsed="0" w:uiPriority="63" w:semiHidden="0" w:name="Medium Shading 1 Accent 1"/>
     <w:lsdException w:unhideWhenUsed="0" w:uiPriority="64" w:semiHidden="0" w:name="Medium Shading 2 Accent 1"/>
     <w:lsdException w:qFormat="1" w:unhideWhenUsed="0" w:uiPriority="65" w:semiHidden="0" w:name="Medium List 1 Accent 1"/>
@@ -5225,6 +5244,7 @@
   <w:style w:type="table" w:styleId="54">
     <w:name w:val="Light Grid Accent 1"/>
     <w:basedOn w:val="12"/>
+    <w:qFormat/>
     <w:uiPriority w:val="62"/>
     <w:pPr>
       <w:spacing w:after="0" w:line="240" w:lineRule="auto"/>

</xml_diff>